<commit_message>
docs: update HMS User Access & Platform Guide to v3
Reflects the role-age/aging-SLA and Source Quality changes shipped in
0daa57f: Open Date is now stamped only at approval (never editable),
aging alerts only ever apply to Approved/Live – Sourcing roles, and
Source Quality reports the finalized 5-channel vocabulary instead of
the retired application-level field. Two new FAQ entries added for
the same two changes.
</commit_message>
<xml_diff>
--- a/DigitalPaani_HMS_User_Access_Guide.docx
+++ b/DigitalPaani_HMS_User_Access_Guide.docx
@@ -94,7 +94,7 @@
           <w:sz w:val="18"/>
           <w:szCs w:val="18"/>
         </w:rPr>
-        <w:t xml:space="preserve">Version 2  ·  August 2026</w:t>
+        <w:t xml:space="preserve">Version 3  ·  August 2026</w:t>
       </w:r>
     </w:p>
     <w:p>
@@ -2029,7 +2029,7 @@
           <w:sz w:val="21"/>
           <w:szCs w:val="21"/>
         </w:rPr>
-        <w:t xml:space="preserve"> — a table of open roles that have passed their own </w:t>
+        <w:t xml:space="preserve"> — a table of roles that have passed their own </w:t>
       </w:r>
       <w:r>
         <w:rPr>
@@ -2047,7 +2047,43 @@
           <w:sz w:val="21"/>
           <w:szCs w:val="21"/>
         </w:rPr>
-        <w:t xml:space="preserve"> date, colored yellow then red the further overdue they are (thresholds vary by priority — P0 flags soonest, P3 latest). A role with no Close Target set yet falls back to flagging on days-since-opened instead. Nothing appears here until a role is actually overdue against its own target.</w:t>
+        <w:t xml:space="preserve"> date, colored yellow then red the further overdue they are (thresholds vary by priority — P0 flags soonest, P3 latest). A role with no Close Target set yet falls back to flagging on days-since-approved instead. This table — and every aging alert anywhere in HMS — only ever applies to a role currently </w:t>
+      </w:r>
+      <w:r>
+        <w:rPr>
+          <w:rFonts w:ascii="Calibri" w:cs="Calibri" w:eastAsia="Calibri" w:hAnsi="Calibri"/>
+          <w:b/>
+          <w:bCs/>
+          <w:sz w:val="21"/>
+          <w:szCs w:val="21"/>
+        </w:rPr>
+        <w:t xml:space="preserve">Approved</w:t>
+      </w:r>
+      <w:r>
+        <w:rPr>
+          <w:rFonts w:ascii="Calibri" w:cs="Calibri" w:eastAsia="Calibri" w:hAnsi="Calibri"/>
+          <w:sz w:val="21"/>
+          <w:szCs w:val="21"/>
+        </w:rPr>
+        <w:t xml:space="preserve"> or </w:t>
+      </w:r>
+      <w:r>
+        <w:rPr>
+          <w:rFonts w:ascii="Calibri" w:cs="Calibri" w:eastAsia="Calibri" w:hAnsi="Calibri"/>
+          <w:b/>
+          <w:bCs/>
+          <w:sz w:val="21"/>
+          <w:szCs w:val="21"/>
+        </w:rPr>
+        <w:t xml:space="preserve">Live – Sourcing</w:t>
+      </w:r>
+      <w:r>
+        <w:rPr>
+          <w:rFonts w:ascii="Calibri" w:cs="Calibri" w:eastAsia="Calibri" w:hAnsi="Calibri"/>
+          <w:sz w:val="21"/>
+          <w:szCs w:val="21"/>
+        </w:rPr>
+        <w:t xml:space="preserve">; a Draft, Under Review, On Hold, or Closed role never shows an aging alert, no matter how old its dates look. Nothing appears here until an eligible role is actually overdue against its own target.</w:t>
       </w:r>
     </w:p>
     <w:p>
@@ -2111,7 +2147,25 @@
           <w:sz w:val="21"/>
           <w:szCs w:val="21"/>
         </w:rPr>
-        <w:t xml:space="preserve"> — Source Quality shows pass rate, hire rate, and % contribution per sourcing channel, computed over all-time history. Low Pipeline Roles lists open, already-aging roles that currently have fewer than 3 active candidates — a signal that sourcing, not process, may be the bottleneck.</w:t>
+        <w:t xml:space="preserve"> — Source Quality shows pass rate, hire rate, and % contribution per sourcing channel, computed over all-time history from each candidate’s own </w:t>
+      </w:r>
+      <w:r>
+        <w:rPr>
+          <w:rFonts w:ascii="Calibri" w:cs="Calibri" w:eastAsia="Calibri" w:hAnsi="Calibri"/>
+          <w:b/>
+          <w:bCs/>
+          <w:sz w:val="21"/>
+          <w:szCs w:val="21"/>
+        </w:rPr>
+        <w:t xml:space="preserve">Source</w:t>
+      </w:r>
+      <w:r>
+        <w:rPr>
+          <w:rFonts w:ascii="Calibri" w:cs="Calibri" w:eastAsia="Calibri" w:hAnsi="Calibri"/>
+          <w:sz w:val="21"/>
+          <w:szCs w:val="21"/>
+        </w:rPr>
+        <w:t xml:space="preserve"> (Naukri/IIMjobs, LinkedIn, Internal Referral, Agency, or Direct Outreach — the same 5-channel vocabulary a role’s own Recruitment Mode uses). Low Pipeline Roles lists open, already-aging roles that currently have fewer than 3 active candidates — a signal that sourcing, not process, may be the bottleneck.</w:t>
       </w:r>
     </w:p>
     <w:p>
@@ -2572,6 +2626,29 @@
           <w:sz w:val="21"/>
           <w:szCs w:val="21"/>
         </w:rPr>
+        <w:t xml:space="preserve">Open Date is set automatically, once, at approval</w:t>
+      </w:r>
+      <w:r>
+        <w:rPr>
+          <w:rFonts w:ascii="Calibri" w:cs="Calibri" w:eastAsia="Calibri" w:hAnsi="Calibri"/>
+          <w:sz w:val="21"/>
+          <w:szCs w:val="21"/>
+        </w:rPr>
+        <w:t xml:space="preserve"> — the moment a role’s status actually becomes Approved, HMS stamps that day as its Open Date; it’s never a field you type in yourself, at creation or afterward. Role Age is measured from that date, so it always tracks “days since approved,” never “days since this form was filled in.”</w:t>
+      </w:r>
+    </w:p>
+    <w:p>
+      <w:pPr>
+        <w:spacing w:after="140"/>
+      </w:pPr>
+      <w:r>
+        <w:rPr>
+          <w:rFonts w:ascii="Calibri" w:cs="Calibri" w:eastAsia="Calibri" w:hAnsi="Calibri"/>
+          <w:b/>
+          <w:bCs/>
+          <w:sz w:val="21"/>
+          <w:szCs w:val="21"/>
+        </w:rPr>
         <w:t xml:space="preserve">Aging is tied to each role’s own Close Target</w:t>
       </w:r>
       <w:r>
@@ -2580,7 +2657,7 @@
           <w:sz w:val="21"/>
           <w:szCs w:val="21"/>
         </w:rPr>
-        <w:t xml:space="preserve">, not simply how long ago it opened. Set a realistic Close Target when approving a role; pushing it out later genuinely clears an aging alert, rather than the system assuming the original plan was wrong.</w:t>
+        <w:t xml:space="preserve">, not simply how long ago it opened. Set a realistic Close Target when approving a role; pushing it out later genuinely clears an aging alert, rather than the system assuming the original plan was wrong. An aging alert (and Role Age itself) only ever appears while a role is Approved or Live – Sourcing — once it goes On Hold or Closed, or if it’s still Draft/Under Review, aging simply doesn’t apply.</w:t>
       </w:r>
     </w:p>
     <w:p>
@@ -2672,7 +2749,7 @@
           <w:sz w:val="21"/>
           <w:szCs w:val="21"/>
         </w:rPr>
-        <w:t xml:space="preserve">Fill in Basic Information (title, department, hiring manager, priority, openings, location, employment type, dates), Requirements/Description (must-have and nice-to-have skills, job description), and Sourcing (which recruitment channels to use).</w:t>
+        <w:t xml:space="preserve">Fill in Basic Information (title, department, hiring manager, priority, openings, location, employment type, Target Close Date), Requirements/Description (must-have and nice-to-have skills, job description), and Sourcing (which recruitment channels to use).</w:t>
       </w:r>
     </w:p>
     <w:p>
@@ -2760,7 +2837,7 @@
           <w:sz w:val="21"/>
           <w:szCs w:val="21"/>
         </w:rPr>
-        <w:t xml:space="preserve">Set a realistic Close Target while you’re here — this is what drives the role’s aging alerts from now on.</w:t>
+        <w:t xml:space="preserve">Set a realistic Close Target while you’re here — this is what drives the role’s aging alerts from now on. Its Open Date is stamped automatically the moment you confirm the approval below — there’s nothing to fill in for that.</w:t>
       </w:r>
     </w:p>
     <w:p>
@@ -7347,6 +7424,66 @@
           <w:sz w:val="21"/>
           <w:szCs w:val="21"/>
         </w:rPr>
+        <w:t xml:space="preserve">A role I approved a while ago shows no Role Age / aging alert, or it disappeared once I put it On Hold — is that a bug?</w:t>
+      </w:r>
+    </w:p>
+    <w:p>
+      <w:pPr>
+        <w:spacing w:after="140"/>
+      </w:pPr>
+      <w:r>
+        <w:rPr>
+          <w:rFonts w:ascii="Calibri" w:cs="Calibri" w:eastAsia="Calibri" w:hAnsi="Calibri"/>
+          <w:sz w:val="21"/>
+          <w:szCs w:val="21"/>
+        </w:rPr>
+        <w:t xml:space="preserve">No — Role Age and aging alerts only ever apply to a role that’s Approved or Live – Sourcing. Draft and Under Review haven’t started the clock yet; On Hold and Closed have stopped it. Moving a role back to Live – Sourcing resumes it against the same Open Date it was originally approved on.</w:t>
+      </w:r>
+    </w:p>
+    <w:p>
+      <w:pPr>
+        <w:keepNext/>
+        <w:spacing w:after="40" w:before="160"/>
+      </w:pPr>
+      <w:r>
+        <w:rPr>
+          <w:rFonts w:ascii="Calibri" w:cs="Calibri" w:eastAsia="Calibri" w:hAnsi="Calibri"/>
+          <w:b/>
+          <w:bCs/>
+          <w:color w:val="0A1F3D"/>
+          <w:sz w:val="21"/>
+          <w:szCs w:val="21"/>
+        </w:rPr>
+        <w:t xml:space="preserve">The Source Quality channels on the Dashboard look different from what I remember — what changed?</w:t>
+      </w:r>
+    </w:p>
+    <w:p>
+      <w:pPr>
+        <w:spacing w:after="140"/>
+      </w:pPr>
+      <w:r>
+        <w:rPr>
+          <w:rFonts w:ascii="Calibri" w:cs="Calibri" w:eastAsia="Calibri" w:hAnsi="Calibri"/>
+          <w:sz w:val="21"/>
+          <w:szCs w:val="21"/>
+        </w:rPr>
+        <w:t xml:space="preserve">Source Quality now reports each candidate’s own Source field (Naukri/IIMjobs, LinkedIn, Internal Referral, Agency, Direct Outreach) instead of an older, separate application-level field that stopped being collected a while back. If a channel name you used to see is gone, it’s because it was retired from that older vocabulary, not because the data disappeared.</w:t>
+      </w:r>
+    </w:p>
+    <w:p>
+      <w:pPr>
+        <w:keepNext/>
+        <w:spacing w:after="40" w:before="160"/>
+      </w:pPr>
+      <w:r>
+        <w:rPr>
+          <w:rFonts w:ascii="Calibri" w:cs="Calibri" w:eastAsia="Calibri" w:hAnsi="Calibri"/>
+          <w:b/>
+          <w:bCs/>
+          <w:color w:val="0A1F3D"/>
+          <w:sz w:val="21"/>
+          <w:szCs w:val="21"/>
+        </w:rPr>
         <w:t xml:space="preserve">A candidate I rejected/withdrew a while ago has disappeared from Candidates — where did they go?</w:t>
       </w:r>
     </w:p>

</xml_diff>